<commit_message>
Update mode d'emploi v1.1: Mistral AI + section config API detaillee
- Version 1.0 -> 1.1 (Avril 2026)
- Remplacement Anthropic par Mistral AI dans section 13.2
- Commande deploy mise a jour avec --domain/--email CLI args
- Ajout section 13.5 : configuration detaillee des cles API (.env)
  - MISTRAL_API_KEY, EODHD_API_KEY, FMP_API_KEY, NEWSAPI_KEY
  - Cles optionnelles Telegram et Email avec procedures
  - Explication admin Django vs fichier .env

Co-Authored-By: Claude Opus 4.6 (1M context) <noreply@anthropic.com>
</commit_message>
<xml_diff>
--- a/PEA_Dashboard_Mode_Emploi.docx
+++ b/PEA_Dashboard_Mode_Emploi.docx
@@ -82,7 +82,7 @@
           <w:sz w:val="22"/>
           <w:szCs w:val="22"/>
         </w:rPr>
-        <w:t xml:space="preserve">Version 1.0  —  Mars 2026</w:t>
+        <w:t xml:space="preserve">Version 1.1  —  Avril 2026</w:t>
       </w:r>
     </w:p>
     <w:p>
@@ -12604,7 +12604,7 @@
           <w:sz w:val="22"/>
           <w:szCs w:val="22"/>
         </w:rPr>
-        <w:t xml:space="preserve">Modifier les variables DOMAINE et EMAIL_CERTBOT en haut du fichier</w:t>
+        <w:t xml:space="preserve">Aucune modification du fichier nécessaire — les paramètres se passent en ligne de commande</w:t>
       </w:r>
     </w:p>
     <w:p>
@@ -12642,7 +12642,7 @@
           <w:sz w:val="22"/>
           <w:szCs w:val="22"/>
         </w:rPr>
-        <w:t xml:space="preserve">Si le scan est OK, lancer l'installation : sudo python3 pea_deploy.py --install</w:t>
+        <w:t xml:space="preserve">Si le scan est OK, lancer l'installation : sudo python3 pea_deploy.py --install --domain pea.mondomaine.fr --email fred@mondomaine.fr --no-ssl</w:t>
       </w:r>
     </w:p>
     <w:p>
@@ -12932,7 +12932,7 @@
                 <w:sz w:val="21"/>
                 <w:szCs w:val="21"/>
               </w:rPr>
-              <w:t xml:space="preserve">Anthropic (Claude)</w:t>
+              <w:t xml:space="preserve">Mistral AI</w:t>
             </w:r>
           </w:p>
         </w:tc>
@@ -12961,7 +12961,7 @@
                 <w:sz w:val="21"/>
                 <w:szCs w:val="21"/>
               </w:rPr>
-              <w:t xml:space="preserve">https://console.anthropic.com — paiement à l'usage — environ 0.01€/jour d'utilisation normale</w:t>
+              <w:t xml:space="preserve">https://console.mistral.ai — paiement à l'usage — environ 0.01€/jour d'utilisation normale</w:t>
             </w:r>
           </w:p>
         </w:tc>
@@ -13299,6 +13299,365 @@
       </w:r>
     </w:p>
     <w:p>
+      <w:pPr>
+        <w:pStyle w:val="Heading2"/>
+        <w:spacing w:after="200" w:before="400"/>
+      </w:pPr>
+      <w:r>
+        <w:rPr>
+          <w:rFonts w:ascii="Arial" w:cs="Arial" w:eastAsia="Arial" w:hAnsi="Arial"/>
+          <w:b/>
+          <w:sz w:val="28"/>
+          <w:szCs w:val="28"/>
+        </w:rPr>
+        <w:t xml:space="preserve">13.5  Configuration des clés API dans le fichier .env</w:t>
+      </w:r>
+    </w:p>
+    <w:p>
+      <w:r>
+        <w:rPr>
+          <w:rFonts w:ascii="Arial" w:cs="Arial" w:eastAsia="Arial" w:hAnsi="Arial"/>
+          <w:sz w:val="21"/>
+          <w:szCs w:val="21"/>
+        </w:rPr>
+        <w:t xml:space="preserve">Toutes les clés API se configurent dans le fichier /var/www/pea/.env sur le serveur. Ce fichier contient les paramètres sensibles (mots de passe, clés) qui ne doivent jamais être partagés.</w:t>
+      </w:r>
+    </w:p>
+    <w:p>
+      <w:pPr>
+        <w:spacing w:after="120" w:before="240"/>
+      </w:pPr>
+      <w:r>
+        <w:rPr>
+          <w:rFonts w:ascii="Arial" w:cs="Arial" w:eastAsia="Arial" w:hAnsi="Arial"/>
+          <w:b/>
+          <w:sz w:val="22"/>
+          <w:szCs w:val="22"/>
+        </w:rPr>
+        <w:t xml:space="preserve">Commande pour éditer le fichier :</w:t>
+      </w:r>
+    </w:p>
+    <w:p>
+      <w:pPr>
+        <w:shd w:fill="F5F5F3" w:val="clear"/>
+        <w:spacing w:after="200"/>
+      </w:pPr>
+      <w:r>
+        <w:rPr>
+          <w:rFonts w:ascii="Consolas" w:cs="Consolas" w:eastAsia="Consolas" w:hAnsi="Consolas"/>
+          <w:sz w:val="20"/>
+          <w:szCs w:val="20"/>
+        </w:rPr>
+        <w:t xml:space="preserve">sudo -u www-data nano /var/www/pea/.env</w:t>
+      </w:r>
+    </w:p>
+    <w:p>
+      <w:pPr>
+        <w:spacing w:after="120" w:before="240"/>
+      </w:pPr>
+      <w:r>
+        <w:rPr>
+          <w:rFonts w:ascii="Arial" w:cs="Arial" w:eastAsia="Arial" w:hAnsi="Arial"/>
+          <w:b/>
+          <w:sz w:val="22"/>
+          <w:szCs w:val="22"/>
+        </w:rPr>
+        <w:t xml:space="preserve">Clés obligatoires :</w:t>
+      </w:r>
+    </w:p>
+    <w:p>
+      <w:pPr>
+        <w:spacing w:after="80"/>
+      </w:pPr>
+      <w:r>
+        <w:rPr>
+          <w:rFonts w:ascii="Consolas" w:cs="Consolas" w:eastAsia="Consolas" w:hAnsi="Consolas"/>
+          <w:b/>
+          <w:color w:val="185FA5"/>
+          <w:sz w:val="21"/>
+          <w:szCs w:val="21"/>
+        </w:rPr>
+        <w:t xml:space="preserve">MISTRAL_API_KEY</w:t>
+      </w:r>
+      <w:r>
+        <w:rPr>
+          <w:rFonts w:ascii="Arial" w:cs="Arial" w:eastAsia="Arial" w:hAnsi="Arial"/>
+          <w:sz w:val="21"/>
+          <w:szCs w:val="21"/>
+        </w:rPr>
+        <w:t xml:space="preserve"> — Mistral AI (scoring sentiment des articles + rédaction des alertes + digest hebdomadaire). Inscription : https://console.mistral.ai → section « API Keys » → créer une clé. Tarification à l’usage, quelques centimes par mois pour un usage normal.</w:t>
+      </w:r>
+    </w:p>
+    <w:p>
+      <w:pPr>
+        <w:spacing w:after="80"/>
+      </w:pPr>
+      <w:r>
+        <w:rPr>
+          <w:rFonts w:ascii="Consolas" w:cs="Consolas" w:eastAsia="Consolas" w:hAnsi="Consolas"/>
+          <w:b/>
+          <w:color w:val="185FA5"/>
+          <w:sz w:val="21"/>
+          <w:szCs w:val="21"/>
+        </w:rPr>
+        <w:t xml:space="preserve">EODHD_API_KEY</w:t>
+      </w:r>
+      <w:r>
+        <w:rPr>
+          <w:rFonts w:ascii="Arial" w:cs="Arial" w:eastAsia="Arial" w:hAnsi="Arial"/>
+          <w:sz w:val="21"/>
+          <w:szCs w:val="21"/>
+        </w:rPr>
+        <w:t xml:space="preserve"> — EODHD (cours de clôture EOD, fondamentaux, screener PEA). Inscription : https://eodhd.com/register. Plan gratuit : 20 requêtes/jour, suffisant pour moins de 20 titres.</w:t>
+      </w:r>
+    </w:p>
+    <w:p>
+      <w:pPr>
+        <w:spacing w:after="80"/>
+      </w:pPr>
+      <w:r>
+        <w:rPr>
+          <w:rFonts w:ascii="Consolas" w:cs="Consolas" w:eastAsia="Consolas" w:hAnsi="Consolas"/>
+          <w:b/>
+          <w:color w:val="185FA5"/>
+          <w:sz w:val="21"/>
+          <w:szCs w:val="21"/>
+        </w:rPr>
+        <w:t xml:space="preserve">FMP_API_KEY</w:t>
+      </w:r>
+      <w:r>
+        <w:rPr>
+          <w:rFonts w:ascii="Arial" w:cs="Arial" w:eastAsia="Arial" w:hAnsi="Arial"/>
+          <w:sz w:val="21"/>
+          <w:szCs w:val="21"/>
+        </w:rPr>
+        <w:t xml:space="preserve"> — Financial Modeling Prep (fondamentaux complémentaires : PER, ROE, marges, dette, dividendes). Inscription : https://site.financialmodelingprep.com/developer. Plan gratuit : 250 requêtes/jour.</w:t>
+      </w:r>
+    </w:p>
+    <w:p>
+      <w:pPr>
+        <w:spacing w:after="80"/>
+      </w:pPr>
+      <w:r>
+        <w:rPr>
+          <w:rFonts w:ascii="Consolas" w:cs="Consolas" w:eastAsia="Consolas" w:hAnsi="Consolas"/>
+          <w:b/>
+          <w:color w:val="185FA5"/>
+          <w:sz w:val="21"/>
+          <w:szCs w:val="21"/>
+        </w:rPr>
+        <w:t xml:space="preserve">NEWSAPI_KEY</w:t>
+      </w:r>
+      <w:r>
+        <w:rPr>
+          <w:rFonts w:ascii="Arial" w:cs="Arial" w:eastAsia="Arial" w:hAnsi="Arial"/>
+          <w:sz w:val="21"/>
+          <w:szCs w:val="21"/>
+        </w:rPr>
+        <w:t xml:space="preserve"> — NewsAPI (articles de presse financière pour l’analyse de sentiment IA). Inscription : https://newsapi.org/register. Plan gratuit : 100 requêtes/jour.</w:t>
+      </w:r>
+    </w:p>
+    <w:p>
+      <w:pPr>
+        <w:spacing w:after="120" w:before="240"/>
+      </w:pPr>
+      <w:r>
+        <w:rPr>
+          <w:rFonts w:ascii="Arial" w:cs="Arial" w:eastAsia="Arial" w:hAnsi="Arial"/>
+          <w:b/>
+          <w:sz w:val="22"/>
+          <w:szCs w:val="22"/>
+        </w:rPr>
+        <w:t xml:space="preserve">Clés optionnelles (notifications) :</w:t>
+      </w:r>
+    </w:p>
+    <w:p>
+      <w:pPr>
+        <w:spacing w:after="80"/>
+      </w:pPr>
+      <w:r>
+        <w:rPr>
+          <w:rFonts w:ascii="Consolas" w:cs="Consolas" w:eastAsia="Consolas" w:hAnsi="Consolas"/>
+          <w:b/>
+          <w:color w:val="185FA5"/>
+          <w:sz w:val="21"/>
+          <w:szCs w:val="21"/>
+        </w:rPr>
+        <w:t xml:space="preserve">TELEGRAM_BOT_TOKEN + TELEGRAM_CHAT_ID</w:t>
+      </w:r>
+      <w:r>
+        <w:rPr>
+          <w:rFonts w:ascii="Arial" w:cs="Arial" w:eastAsia="Arial" w:hAnsi="Arial"/>
+          <w:sz w:val="21"/>
+          <w:szCs w:val="21"/>
+        </w:rPr>
+        <w:t xml:space="preserve"> — Pour recevoir les alertes sur votre téléphone via Telegram. Voir section 8.3 du mode d’emploi pour la configuration détaillée pas à pas.</w:t>
+      </w:r>
+    </w:p>
+    <w:p>
+      <w:pPr>
+        <w:spacing w:after="80"/>
+      </w:pPr>
+      <w:r>
+        <w:rPr>
+          <w:rFonts w:ascii="Consolas" w:cs="Consolas" w:eastAsia="Consolas" w:hAnsi="Consolas"/>
+          <w:b/>
+          <w:color w:val="185FA5"/>
+          <w:sz w:val="21"/>
+          <w:szCs w:val="21"/>
+        </w:rPr>
+        <w:t xml:space="preserve">EMAIL_HOST_USER + EMAIL_HOST_PASSWORD</w:t>
+      </w:r>
+      <w:r>
+        <w:rPr>
+          <w:rFonts w:ascii="Arial" w:cs="Arial" w:eastAsia="Arial" w:hAnsi="Arial"/>
+          <w:sz w:val="21"/>
+          <w:szCs w:val="21"/>
+        </w:rPr>
+        <w:t xml:space="preserve"> — Pour recevoir les digests et alertes par email via Gmail. Ne pas utiliser votre mot de passe principal. Aller dans votre compte Google → Sécurité → Validation en 2 étapes → Mots de passe des applications → créer un mot de passe pour « PEA Dashboard ».</w:t>
+      </w:r>
+    </w:p>
+    <w:p>
+      <w:pPr>
+        <w:spacing w:after="120" w:before="240"/>
+      </w:pPr>
+      <w:r>
+        <w:rPr>
+          <w:rFonts w:ascii="Arial" w:cs="Arial" w:eastAsia="Arial" w:hAnsi="Arial"/>
+          <w:b/>
+          <w:sz w:val="22"/>
+          <w:szCs w:val="22"/>
+        </w:rPr>
+        <w:t xml:space="preserve">Après modification du .env, redémarrer les services :</w:t>
+      </w:r>
+    </w:p>
+    <w:p>
+      <w:pPr>
+        <w:shd w:fill="F5F5F3" w:val="clear"/>
+        <w:spacing w:after="200"/>
+      </w:pPr>
+      <w:r>
+        <w:rPr>
+          <w:rFonts w:ascii="Consolas" w:cs="Consolas" w:eastAsia="Consolas" w:hAnsi="Consolas"/>
+          <w:sz w:val="20"/>
+          <w:szCs w:val="20"/>
+        </w:rPr>
+        <w:t xml:space="preserve">sudo supervisorctl restart pea_gunicorn pea_celery_worker pea_celery_beat</w:t>
+      </w:r>
+    </w:p>
+    <w:p>
+      <w:pPr>
+        <w:spacing w:after="120" w:before="240"/>
+      </w:pPr>
+      <w:r>
+        <w:rPr>
+          <w:rFonts w:ascii="Arial" w:cs="Arial" w:eastAsia="Arial" w:hAnsi="Arial"/>
+          <w:b/>
+          <w:sz w:val="22"/>
+          <w:szCs w:val="22"/>
+        </w:rPr>
+        <w:t xml:space="preserve">Administration Django (interface web) :</w:t>
+      </w:r>
+    </w:p>
+    <w:p>
+      <w:pPr>
+        <w:spacing w:after="80"/>
+      </w:pPr>
+      <w:r>
+        <w:rPr>
+          <w:rFonts w:ascii="Arial" w:cs="Arial" w:eastAsia="Arial" w:hAnsi="Arial"/>
+          <w:sz w:val="21"/>
+          <w:szCs w:val="21"/>
+        </w:rPr>
+        <w:t xml:space="preserve">L’interface d’administration Django est accessible à http://VOTRE_IP/admin/ avec le compte créé via createsuperuser. Elle permet de :</w:t>
+      </w:r>
+    </w:p>
+    <w:p>
+      <w:pPr>
+        <w:spacing w:after="60"/>
+        <w:ind w:left="360"/>
+      </w:pPr>
+      <w:r>
+        <w:rPr>
+          <w:rFonts w:ascii="Arial" w:cs="Arial" w:eastAsia="Arial" w:hAnsi="Arial"/>
+          <w:sz w:val="21"/>
+          <w:szCs w:val="21"/>
+        </w:rPr>
+        <w:t xml:space="preserve">• Gérer les titres : ajouter, modifier, supprimer des actions du portefeuille et de la surveillance</w:t>
+      </w:r>
+    </w:p>
+    <w:p>
+      <w:pPr>
+        <w:spacing w:after="60"/>
+        <w:ind w:left="360"/>
+      </w:pPr>
+      <w:r>
+        <w:rPr>
+          <w:rFonts w:ascii="Arial" w:cs="Arial" w:eastAsia="Arial" w:hAnsi="Arial"/>
+          <w:sz w:val="21"/>
+          <w:szCs w:val="21"/>
+        </w:rPr>
+        <w:t xml:space="preserve">• Consulter et gérer les alertes générées et leur texte IA</w:t>
+      </w:r>
+    </w:p>
+    <w:p>
+      <w:pPr>
+        <w:spacing w:after="60"/>
+        <w:ind w:left="360"/>
+      </w:pPr>
+      <w:r>
+        <w:rPr>
+          <w:rFonts w:ascii="Arial" w:cs="Arial" w:eastAsia="Arial" w:hAnsi="Arial"/>
+          <w:sz w:val="21"/>
+          <w:szCs w:val="21"/>
+        </w:rPr>
+        <w:t xml:space="preserve">• Voir les articles collectés et leurs scores de sentiment</w:t>
+      </w:r>
+    </w:p>
+    <w:p>
+      <w:pPr>
+        <w:spacing w:after="60"/>
+        <w:ind w:left="360"/>
+      </w:pPr>
+      <w:r>
+        <w:rPr>
+          <w:rFonts w:ascii="Arial" w:cs="Arial" w:eastAsia="Arial" w:hAnsi="Arial"/>
+          <w:sz w:val="21"/>
+          <w:szCs w:val="21"/>
+        </w:rPr>
+        <w:t xml:space="preserve">• Configurer le profil investisseur (horizon, style, tolérance au risque)</w:t>
+      </w:r>
+    </w:p>
+    <w:p>
+      <w:pPr>
+        <w:spacing w:after="60"/>
+        <w:ind w:left="360"/>
+      </w:pPr>
+      <w:r>
+        <w:rPr>
+          <w:rFonts w:ascii="Arial" w:cs="Arial" w:eastAsia="Arial" w:hAnsi="Arial"/>
+          <w:sz w:val="21"/>
+          <w:szCs w:val="21"/>
+        </w:rPr>
+        <w:t xml:space="preserve">• Consulter les fondamentaux et les prix journaliers importés</w:t>
+      </w:r>
+    </w:p>
+    <w:p>
+      <w:pPr>
+        <w:spacing w:after="120" w:before="160"/>
+      </w:pPr>
+      <w:r>
+        <w:rPr>
+          <w:rFonts w:ascii="Arial" w:cs="Arial" w:eastAsia="Arial" w:hAnsi="Arial"/>
+          <w:b/>
+          <w:i/>
+          <w:sz w:val="21"/>
+          <w:szCs w:val="21"/>
+        </w:rPr>
+        <w:t xml:space="preserve">Note importante : les clés API ne se gèrent pas dans l’admin Django mais uniquement dans le fichier .env sur le serveur. L’admin Django sert à gérer les données métier (titres, alertes, profil).</w:t>
+      </w:r>
+    </w:p>
+    <w:p>
       <w:r>
         <w:br w:type="page"/>
       </w:r>
@@ -13338,7 +13697,7 @@
           <w:sz w:val="20"/>
           <w:szCs w:val="20"/>
         </w:rPr>
-        <w:t xml:space="preserve">Version 1.0  ·  Mars 2026  ·  Usage personnel</w:t>
+        <w:t xml:space="preserve">Version 1.1  ·  Avril 2026  ·  Usage personnel</w:t>
       </w:r>
     </w:p>
     <w:p>

</xml_diff>